<commit_message>
minor change for boolean in eval questionnaires
</commit_message>
<xml_diff>
--- a/backend/word-contract-templates/Φύλλο αξιολόγησης Φοιτητή ΕΣΠΑ21-27 εκδοση 2.docx
+++ b/backend/word-contract-templates/Φύλλο αξιολόγησης Φοιτητή ΕΣΠΑ21-27 εκδοση 2.docx
@@ -1,6 +1,6 @@
 
 <file path=word/document.xml><?xml version="1.0" encoding="utf-8"?>
-<w:document xmlns:wpc="http://schemas.microsoft.com/office/word/2010/wordprocessingCanvas" xmlns:cx="http://schemas.microsoft.com/office/drawing/2014/chartex" xmlns:cx1="http://schemas.microsoft.com/office/drawing/2015/9/8/chartex" xmlns:cx2="http://schemas.microsoft.com/office/drawing/2015/10/21/chartex" xmlns:cx3="http://schemas.microsoft.com/office/drawing/2016/5/9/chartex" xmlns:cx4="http://schemas.microsoft.com/office/drawing/2016/5/10/chartex" xmlns:cx5="http://schemas.microsoft.com/office/drawing/2016/5/11/chartex" xmlns:cx6="http://schemas.microsoft.com/office/drawing/2016/5/12/chartex" xmlns:cx7="http://schemas.microsoft.com/office/drawing/2016/5/13/chartex" xmlns:cx8="http://schemas.microsoft.com/office/drawing/2016/5/14/chartex" xmlns:mc="http://schemas.openxmlformats.org/markup-compatibility/2006" xmlns:aink="http://schemas.microsoft.com/office/drawing/2016/ink" xmlns:am3d="http://schemas.microsoft.com/office/drawing/2017/model3d" xmlns:o="urn:schemas-microsoft-com:office:office" xmlns:oel="http://schemas.microsoft.com/office/2019/extlst" xmlns:r="http://schemas.openxmlformats.org/officeDocument/2006/relationships" xmlns:m="http://schemas.openxmlformats.org/officeDocument/2006/math" xmlns:v="urn:schemas-microsoft-com:vml" xmlns:wp14="http://schemas.microsoft.com/office/word/2010/wordprocessingDrawing" xmlns:wp="http://schemas.openxmlformats.org/drawingml/2006/wordprocessingDrawing" xmlns:w10="urn:schemas-microsoft-com:office:word" xmlns:w="http://schemas.openxmlformats.org/wordprocessingml/2006/main" xmlns:w14="http://schemas.microsoft.com/office/word/2010/wordml" xmlns:w15="http://schemas.microsoft.com/office/word/2012/wordml" xmlns:w16cex="http://schemas.microsoft.com/office/word/2018/wordml/cex" xmlns:w16cid="http://schemas.microsoft.com/office/word/2016/wordml/cid" xmlns:w16="http://schemas.microsoft.com/office/word/2018/wordml" xmlns:w16du="http://schemas.microsoft.com/office/word/2023/wordml/word16du" xmlns:w16sdtdh="http://schemas.microsoft.com/office/word/2020/wordml/sdtdatahash" xmlns:w16sdtfl="http://schemas.microsoft.com/office/word/2024/wordml/sdtformatlock" xmlns:w16se="http://schemas.microsoft.com/office/word/2015/wordml/symex" xmlns:wpg="http://schemas.microsoft.com/office/word/2010/wordprocessingGroup" xmlns:wpi="http://schemas.microsoft.com/office/word/2010/wordprocessingInk" xmlns:wne="http://schemas.microsoft.com/office/word/2006/wordml" xmlns:wps="http://schemas.microsoft.com/office/word/2010/wordprocessingShape" mc:Ignorable="w14 w15 w16se w16cid w16 w16cex w16sdtdh w16sdtfl w16du wp14">
+<w:document xmlns:wpc="http://schemas.microsoft.com/office/word/2010/wordprocessingCanvas" xmlns:cx="http://schemas.microsoft.com/office/drawing/2014/chartex" xmlns:mc="http://schemas.openxmlformats.org/markup-compatibility/2006" xmlns:o="urn:schemas-microsoft-com:office:office" xmlns:r="http://schemas.openxmlformats.org/officeDocument/2006/relationships" xmlns:m="http://schemas.openxmlformats.org/officeDocument/2006/math" xmlns:v="urn:schemas-microsoft-com:vml" xmlns:wp14="http://schemas.microsoft.com/office/word/2010/wordprocessingDrawing" xmlns:wp="http://schemas.openxmlformats.org/drawingml/2006/wordprocessingDrawing" xmlns:w10="urn:schemas-microsoft-com:office:word" xmlns:w="http://schemas.openxmlformats.org/wordprocessingml/2006/main" xmlns:w14="http://schemas.microsoft.com/office/word/2010/wordml" xmlns:w15="http://schemas.microsoft.com/office/word/2012/wordml" xmlns:w16se="http://schemas.microsoft.com/office/word/2015/wordml/symex" xmlns:wpg="http://schemas.microsoft.com/office/word/2010/wordprocessingGroup" xmlns:wpi="http://schemas.microsoft.com/office/word/2010/wordprocessingInk" xmlns:wne="http://schemas.microsoft.com/office/word/2006/wordml" xmlns:wps="http://schemas.microsoft.com/office/word/2010/wordprocessingShape" mc:Ignorable="w14 w15 w16se wp14">
   <w:body>
     <w:p>
       <w:pPr>
@@ -19,7 +19,7 @@
       <w:r>
         <w:rPr>
           <w:noProof/>
-          <w:lang w:val="en-US"/>
+          <w:lang w:eastAsia="el-GR"/>
         </w:rPr>
         <w:drawing>
           <wp:anchor distT="0" distB="0" distL="0" distR="0" simplePos="0" relativeHeight="2" behindDoc="0" locked="0" layoutInCell="1" allowOverlap="1" wp14:anchorId="592EAA82" wp14:editId="2B13F4D2">
@@ -380,6 +380,7 @@
           <w:szCs w:val="26"/>
           <w:lang w:val="el-GR"/>
         </w:rPr>
+        <w:lastRenderedPageBreak/>
         <w:t>Συμπληρώνεται από το Φοιτητή</w:t>
       </w:r>
       <w:r>
@@ -927,7 +928,6 @@
           <w:lang w:val="en-US"/>
         </w:rPr>
       </w:pPr>
-      <w:proofErr w:type="gramStart"/>
       <w:r>
         <w:rPr>
           <w:rFonts w:ascii="Calibri" w:hAnsi="Calibri" w:cs="Calibri"/>
@@ -969,7 +969,6 @@
         </w:rPr>
         <w:t>{</w:t>
       </w:r>
-      <w:proofErr w:type="gramEnd"/>
       <w:r>
         <w:rPr>
           <w:rFonts w:ascii="Calibri" w:hAnsi="Calibri" w:cs="Calibri"/>
@@ -1070,7 +1069,7 @@
           <w:bCs/>
           <w:sz w:val="22"/>
           <w:szCs w:val="22"/>
-          <w:lang w:val="en-US"/>
+          <w:lang w:val="el-GR"/>
         </w:rPr>
       </w:pPr>
       <w:r>
@@ -1089,7 +1088,7 @@
           <w:bCs/>
           <w:sz w:val="22"/>
           <w:szCs w:val="22"/>
-          <w:lang w:val="en-US"/>
+          <w:lang w:val="el-GR"/>
         </w:rPr>
         <w:t xml:space="preserve"> </w:t>
       </w:r>
@@ -1109,7 +1108,7 @@
           <w:bCs/>
           <w:sz w:val="22"/>
           <w:szCs w:val="22"/>
-          <w:lang w:val="en-US"/>
+          <w:lang w:val="el-GR"/>
         </w:rPr>
         <w:t xml:space="preserve"> </w:t>
       </w:r>
@@ -1129,7 +1128,7 @@
           <w:bCs/>
           <w:sz w:val="22"/>
           <w:szCs w:val="22"/>
-          <w:lang w:val="en-US"/>
+          <w:lang w:val="el-GR"/>
         </w:rPr>
         <w:t>:</w:t>
       </w:r>
@@ -1140,7 +1139,7 @@
           <w:color w:val="auto"/>
           <w:sz w:val="22"/>
           <w:szCs w:val="22"/>
-          <w:lang w:val="en-US"/>
+          <w:lang w:val="el-GR"/>
         </w:rPr>
         <w:t xml:space="preserve"> </w:t>
       </w:r>
@@ -1150,7 +1149,7 @@
           <w:bCs/>
           <w:sz w:val="22"/>
           <w:szCs w:val="22"/>
-          <w:lang w:val="en-US"/>
+          <w:lang w:val="el-GR"/>
         </w:rPr>
         <w:t>{</w:t>
       </w:r>
@@ -1170,7 +1169,7 @@
           <w:bCs/>
           <w:sz w:val="22"/>
           <w:szCs w:val="22"/>
-          <w:lang w:val="en-US"/>
+          <w:lang w:val="el-GR"/>
         </w:rPr>
         <w:t>01</w:t>
       </w:r>
@@ -1180,7 +1179,7 @@
           <w:bCs/>
           <w:sz w:val="22"/>
           <w:szCs w:val="22"/>
-          <w:lang w:val="en-US"/>
+          <w:lang w:val="el-GR"/>
         </w:rPr>
         <w:t>}</w:t>
       </w:r>
@@ -2381,6 +2380,255 @@
     </w:p>
     <w:p>
       <w:pPr>
+        <w:suppressAutoHyphens w:val="0"/>
+        <w:spacing w:line="330" w:lineRule="atLeast"/>
+        <w:textAlignment w:val="baseline"/>
+        <w:rPr>
+          <w:rFonts w:ascii="Calibri" w:hAnsi="Calibri" w:cs="Calibri"/>
+          <w:bCs/>
+          <w:sz w:val="22"/>
+          <w:szCs w:val="22"/>
+          <w:lang w:val="el-GR"/>
+        </w:rPr>
+      </w:pPr>
+      <w:r>
+        <w:rPr>
+          <w:rFonts w:ascii="Calibri" w:hAnsi="Calibri" w:cs="Calibri"/>
+          <w:b/>
+          <w:bCs/>
+          <w:sz w:val="22"/>
+          <w:szCs w:val="22"/>
+          <w:lang w:val="el-GR"/>
+        </w:rPr>
+        <w:t>6</w:t>
+      </w:r>
+      <w:r>
+        <w:rPr>
+          <w:rFonts w:ascii="Calibri" w:hAnsi="Calibri" w:cs="Calibri"/>
+          <w:b/>
+          <w:bCs/>
+          <w:sz w:val="22"/>
+          <w:szCs w:val="22"/>
+          <w:lang w:val="el-GR"/>
+        </w:rPr>
+        <w:t xml:space="preserve">. </w:t>
+      </w:r>
+      <w:r>
+        <w:rPr>
+          <w:rFonts w:ascii="Calibri" w:hAnsi="Calibri" w:cs="Calibri"/>
+          <w:bCs/>
+          <w:sz w:val="22"/>
+          <w:szCs w:val="22"/>
+          <w:lang w:val="el-GR"/>
+        </w:rPr>
+        <w:t>Σας έγινε πρόταση πρόσληψης μετά το τέλος της Πρακτικής τους Άσκησης</w:t>
+      </w:r>
+    </w:p>
+    <w:p>
+      <w:pPr>
+        <w:spacing w:before="120"/>
+        <w:jc w:val="both"/>
+        <w:rPr>
+          <w:rFonts w:ascii="Calibri" w:hAnsi="Calibri" w:cs="Calibri"/>
+          <w:bCs/>
+          <w:color w:val="1F497D" w:themeColor="text2"/>
+          <w:sz w:val="22"/>
+          <w:szCs w:val="22"/>
+          <w:lang w:val="el-GR"/>
+        </w:rPr>
+      </w:pPr>
+      <w:r>
+        <w:rPr>
+          <w:rFonts w:ascii="Calibri" w:hAnsi="Calibri" w:cs="Calibri"/>
+          <w:bCs/>
+          <w:color w:val="1F497D" w:themeColor="text2"/>
+          <w:sz w:val="22"/>
+          <w:szCs w:val="22"/>
+          <w:lang w:val="el-GR"/>
+        </w:rPr>
+        <w:t>{</w:t>
+      </w:r>
+      <w:r>
+        <w:rPr>
+          <w:rFonts w:ascii="Calibri" w:hAnsi="Calibri" w:cs="Calibri"/>
+          <w:bCs/>
+          <w:color w:val="1F497D" w:themeColor="text2"/>
+          <w:sz w:val="22"/>
+          <w:szCs w:val="22"/>
+          <w:lang w:val="en-US"/>
+        </w:rPr>
+        <w:t>B</w:t>
+      </w:r>
+      <w:r>
+        <w:rPr>
+          <w:rFonts w:ascii="Calibri" w:hAnsi="Calibri" w:cs="Calibri"/>
+          <w:bCs/>
+          <w:color w:val="1F497D" w:themeColor="text2"/>
+          <w:sz w:val="22"/>
+          <w:szCs w:val="22"/>
+          <w:lang w:val="el-GR"/>
+        </w:rPr>
+        <w:t>6</w:t>
+      </w:r>
+      <w:r>
+        <w:rPr>
+          <w:rFonts w:ascii="Calibri" w:hAnsi="Calibri" w:cs="Calibri"/>
+          <w:bCs/>
+          <w:color w:val="1F497D" w:themeColor="text2"/>
+          <w:sz w:val="22"/>
+          <w:szCs w:val="22"/>
+          <w:lang w:val="el-GR"/>
+        </w:rPr>
+        <w:t>}</w:t>
+      </w:r>
+    </w:p>
+    <w:p>
+      <w:pPr>
+        <w:spacing w:before="120"/>
+        <w:jc w:val="both"/>
+        <w:rPr>
+          <w:rFonts w:ascii="Calibri" w:hAnsi="Calibri" w:cs="Calibri"/>
+          <w:bCs/>
+          <w:sz w:val="22"/>
+          <w:szCs w:val="22"/>
+          <w:lang w:val="el-GR"/>
+        </w:rPr>
+      </w:pPr>
+      <w:r>
+        <w:rPr>
+          <w:rFonts w:ascii="Calibri" w:hAnsi="Calibri" w:cs="Calibri"/>
+          <w:b/>
+          <w:bCs/>
+          <w:sz w:val="22"/>
+          <w:szCs w:val="22"/>
+          <w:lang w:val="el-GR"/>
+        </w:rPr>
+        <w:t>7</w:t>
+      </w:r>
+      <w:r>
+        <w:rPr>
+          <w:rFonts w:ascii="Calibri" w:hAnsi="Calibri" w:cs="Calibri"/>
+          <w:b/>
+          <w:bCs/>
+          <w:sz w:val="22"/>
+          <w:szCs w:val="22"/>
+          <w:lang w:val="el-GR"/>
+        </w:rPr>
+        <w:t xml:space="preserve">. </w:t>
+      </w:r>
+      <w:r>
+        <w:rPr>
+          <w:rFonts w:ascii="Calibri" w:hAnsi="Calibri" w:cs="Calibri"/>
+          <w:bCs/>
+          <w:sz w:val="22"/>
+          <w:szCs w:val="22"/>
+          <w:lang w:val="el-GR"/>
+        </w:rPr>
+        <w:t xml:space="preserve">Προσληφθήκατε την τελευταία διετία από το έτος αναφοράς (για τα 2 </w:t>
+      </w:r>
+      <w:proofErr w:type="spellStart"/>
+      <w:r>
+        <w:rPr>
+          <w:rFonts w:ascii="Calibri" w:hAnsi="Calibri" w:cs="Calibri"/>
+          <w:bCs/>
+          <w:sz w:val="22"/>
+          <w:szCs w:val="22"/>
+          <w:lang w:val="el-GR"/>
+        </w:rPr>
+        <w:t>ακ</w:t>
+      </w:r>
+      <w:proofErr w:type="spellEnd"/>
+      <w:r>
+        <w:rPr>
+          <w:rFonts w:ascii="Calibri" w:hAnsi="Calibri" w:cs="Calibri"/>
+          <w:bCs/>
+          <w:sz w:val="22"/>
+          <w:szCs w:val="22"/>
+          <w:lang w:val="el-GR"/>
+        </w:rPr>
+        <w:t>.</w:t>
+      </w:r>
+      <w:r>
+        <w:rPr>
+          <w:rFonts w:ascii="Calibri" w:hAnsi="Calibri" w:cs="Calibri"/>
+          <w:bCs/>
+          <w:sz w:val="22"/>
+          <w:szCs w:val="22"/>
+          <w:lang w:val="el-GR"/>
+        </w:rPr>
+        <w:t xml:space="preserve"> </w:t>
+      </w:r>
+      <w:r>
+        <w:rPr>
+          <w:rFonts w:ascii="Calibri" w:hAnsi="Calibri" w:cs="Calibri"/>
+          <w:bCs/>
+          <w:sz w:val="22"/>
+          <w:szCs w:val="22"/>
+          <w:lang w:val="el-GR"/>
+        </w:rPr>
+        <w:t>έτη πριν το 2024-2025)</w:t>
+      </w:r>
+    </w:p>
+    <w:p>
+      <w:pPr>
+        <w:spacing w:before="120"/>
+        <w:jc w:val="both"/>
+        <w:rPr>
+          <w:rFonts w:ascii="Calibri" w:hAnsi="Calibri" w:cs="Calibri"/>
+          <w:bCs/>
+          <w:color w:val="1F497D" w:themeColor="text2"/>
+          <w:sz w:val="22"/>
+          <w:szCs w:val="22"/>
+          <w:lang w:val="el-GR"/>
+        </w:rPr>
+      </w:pPr>
+      <w:r>
+        <w:rPr>
+          <w:rFonts w:ascii="Calibri" w:hAnsi="Calibri" w:cs="Calibri"/>
+          <w:bCs/>
+          <w:color w:val="1F497D" w:themeColor="text2"/>
+          <w:sz w:val="22"/>
+          <w:szCs w:val="22"/>
+          <w:lang w:val="el-GR"/>
+        </w:rPr>
+        <w:t>{</w:t>
+      </w:r>
+      <w:r>
+        <w:rPr>
+          <w:rFonts w:ascii="Calibri" w:hAnsi="Calibri" w:cs="Calibri"/>
+          <w:bCs/>
+          <w:color w:val="1F497D" w:themeColor="text2"/>
+          <w:sz w:val="22"/>
+          <w:szCs w:val="22"/>
+          <w:lang w:val="en-US"/>
+        </w:rPr>
+        <w:t>B</w:t>
+      </w:r>
+      <w:r>
+        <w:rPr>
+          <w:rFonts w:ascii="Calibri" w:hAnsi="Calibri" w:cs="Calibri"/>
+          <w:bCs/>
+          <w:color w:val="1F497D" w:themeColor="text2"/>
+          <w:sz w:val="22"/>
+          <w:szCs w:val="22"/>
+          <w:lang w:val="el-GR"/>
+        </w:rPr>
+        <w:t>7</w:t>
+      </w:r>
+      <w:r>
+        <w:rPr>
+          <w:rFonts w:ascii="Calibri" w:hAnsi="Calibri" w:cs="Calibri"/>
+          <w:bCs/>
+          <w:color w:val="1F497D" w:themeColor="text2"/>
+          <w:sz w:val="22"/>
+          <w:szCs w:val="22"/>
+          <w:lang w:val="el-GR"/>
+        </w:rPr>
+        <w:t>}</w:t>
+      </w:r>
+    </w:p>
+    <w:p>
+      <w:pPr>
         <w:keepNext/>
         <w:widowControl w:val="0"/>
         <w:spacing w:before="360"/>
@@ -2405,6 +2653,8 @@
         </w:rPr>
         <w:t>Γ. Ερωτήσεις σχετικές με την Π.Α.</w:t>
       </w:r>
+      <w:bookmarkStart w:id="0" w:name="_GoBack"/>
+      <w:bookmarkEnd w:id="0"/>
     </w:p>
     <w:p>
       <w:pPr>
@@ -3580,7 +3830,7 @@
                 <w:bCs/>
                 <w:sz w:val="22"/>
                 <w:szCs w:val="22"/>
-                <w:lang w:val="en-US"/>
+                <w:lang w:val="el-GR"/>
               </w:rPr>
             </w:pPr>
             <w:r>
@@ -3627,7 +3877,7 @@
                 <w:bCs/>
                 <w:sz w:val="22"/>
                 <w:szCs w:val="22"/>
-                <w:lang w:val="en-US"/>
+                <w:lang w:val="el-GR"/>
               </w:rPr>
             </w:pPr>
             <w:r>
@@ -3652,7 +3902,7 @@
                 <w:bCs/>
                 <w:sz w:val="22"/>
                 <w:szCs w:val="22"/>
-                <w:lang w:val="en-US"/>
+                <w:lang w:val="el-GR"/>
               </w:rPr>
             </w:pPr>
           </w:p>
@@ -3850,7 +4100,7 @@
 </file>
 
 <file path=word/endnotes.xml><?xml version="1.0" encoding="utf-8"?>
-<w:endnotes xmlns:wpc="http://schemas.microsoft.com/office/word/2010/wordprocessingCanvas" xmlns:cx="http://schemas.microsoft.com/office/drawing/2014/chartex" xmlns:cx1="http://schemas.microsoft.com/office/drawing/2015/9/8/chartex" xmlns:cx2="http://schemas.microsoft.com/office/drawing/2015/10/21/chartex" xmlns:cx3="http://schemas.microsoft.com/office/drawing/2016/5/9/chartex" xmlns:cx4="http://schemas.microsoft.com/office/drawing/2016/5/10/chartex" xmlns:cx5="http://schemas.microsoft.com/office/drawing/2016/5/11/chartex" xmlns:cx6="http://schemas.microsoft.com/office/drawing/2016/5/12/chartex" xmlns:cx7="http://schemas.microsoft.com/office/drawing/2016/5/13/chartex" xmlns:cx8="http://schemas.microsoft.com/office/drawing/2016/5/14/chartex" xmlns:mc="http://schemas.openxmlformats.org/markup-compatibility/2006" xmlns:aink="http://schemas.microsoft.com/office/drawing/2016/ink" xmlns:am3d="http://schemas.microsoft.com/office/drawing/2017/model3d" xmlns:o="urn:schemas-microsoft-com:office:office" xmlns:oel="http://schemas.microsoft.com/office/2019/extlst" xmlns:r="http://schemas.openxmlformats.org/officeDocument/2006/relationships" xmlns:m="http://schemas.openxmlformats.org/officeDocument/2006/math" xmlns:v="urn:schemas-microsoft-com:vml" xmlns:wp14="http://schemas.microsoft.com/office/word/2010/wordprocessingDrawing" xmlns:wp="http://schemas.openxmlformats.org/drawingml/2006/wordprocessingDrawing" xmlns:w10="urn:schemas-microsoft-com:office:word" xmlns:w="http://schemas.openxmlformats.org/wordprocessingml/2006/main" xmlns:w14="http://schemas.microsoft.com/office/word/2010/wordml" xmlns:w15="http://schemas.microsoft.com/office/word/2012/wordml" xmlns:w16cex="http://schemas.microsoft.com/office/word/2018/wordml/cex" xmlns:w16cid="http://schemas.microsoft.com/office/word/2016/wordml/cid" xmlns:w16="http://schemas.microsoft.com/office/word/2018/wordml" xmlns:w16du="http://schemas.microsoft.com/office/word/2023/wordml/word16du" xmlns:w16sdtdh="http://schemas.microsoft.com/office/word/2020/wordml/sdtdatahash" xmlns:w16sdtfl="http://schemas.microsoft.com/office/word/2024/wordml/sdtformatlock" xmlns:w16se="http://schemas.microsoft.com/office/word/2015/wordml/symex" xmlns:wpg="http://schemas.microsoft.com/office/word/2010/wordprocessingGroup" xmlns:wpi="http://schemas.microsoft.com/office/word/2010/wordprocessingInk" xmlns:wne="http://schemas.microsoft.com/office/word/2006/wordml" xmlns:wps="http://schemas.microsoft.com/office/word/2010/wordprocessingShape" mc:Ignorable="w14 w15 w16se w16cid w16 w16cex w16sdtdh w16sdtfl w16du wp14">
+<w:endnotes xmlns:wpc="http://schemas.microsoft.com/office/word/2010/wordprocessingCanvas" xmlns:cx="http://schemas.microsoft.com/office/drawing/2014/chartex" xmlns:mc="http://schemas.openxmlformats.org/markup-compatibility/2006" xmlns:o="urn:schemas-microsoft-com:office:office" xmlns:r="http://schemas.openxmlformats.org/officeDocument/2006/relationships" xmlns:m="http://schemas.openxmlformats.org/officeDocument/2006/math" xmlns:v="urn:schemas-microsoft-com:vml" xmlns:wp14="http://schemas.microsoft.com/office/word/2010/wordprocessingDrawing" xmlns:wp="http://schemas.openxmlformats.org/drawingml/2006/wordprocessingDrawing" xmlns:w10="urn:schemas-microsoft-com:office:word" xmlns:w="http://schemas.openxmlformats.org/wordprocessingml/2006/main" xmlns:w14="http://schemas.microsoft.com/office/word/2010/wordml" xmlns:w15="http://schemas.microsoft.com/office/word/2012/wordml" xmlns:w16se="http://schemas.microsoft.com/office/word/2015/wordml/symex" xmlns:wpg="http://schemas.microsoft.com/office/word/2010/wordprocessingGroup" xmlns:wpi="http://schemas.microsoft.com/office/word/2010/wordprocessingInk" xmlns:wne="http://schemas.microsoft.com/office/word/2006/wordml" xmlns:wps="http://schemas.microsoft.com/office/word/2010/wordprocessingShape" mc:Ignorable="w14 w15 w16se wp14">
   <w:endnote w:type="separator" w:id="-1">
     <w:p>
       <w:r>
@@ -3869,7 +4119,7 @@
 </file>
 
 <file path=word/footer1.xml><?xml version="1.0" encoding="utf-8"?>
-<w:ftr xmlns:wpc="http://schemas.microsoft.com/office/word/2010/wordprocessingCanvas" xmlns:cx="http://schemas.microsoft.com/office/drawing/2014/chartex" xmlns:cx1="http://schemas.microsoft.com/office/drawing/2015/9/8/chartex" xmlns:cx2="http://schemas.microsoft.com/office/drawing/2015/10/21/chartex" xmlns:cx3="http://schemas.microsoft.com/office/drawing/2016/5/9/chartex" xmlns:cx4="http://schemas.microsoft.com/office/drawing/2016/5/10/chartex" xmlns:cx5="http://schemas.microsoft.com/office/drawing/2016/5/11/chartex" xmlns:cx6="http://schemas.microsoft.com/office/drawing/2016/5/12/chartex" xmlns:cx7="http://schemas.microsoft.com/office/drawing/2016/5/13/chartex" xmlns:cx8="http://schemas.microsoft.com/office/drawing/2016/5/14/chartex" xmlns:mc="http://schemas.openxmlformats.org/markup-compatibility/2006" xmlns:aink="http://schemas.microsoft.com/office/drawing/2016/ink" xmlns:am3d="http://schemas.microsoft.com/office/drawing/2017/model3d" xmlns:o="urn:schemas-microsoft-com:office:office" xmlns:oel="http://schemas.microsoft.com/office/2019/extlst" xmlns:r="http://schemas.openxmlformats.org/officeDocument/2006/relationships" xmlns:m="http://schemas.openxmlformats.org/officeDocument/2006/math" xmlns:v="urn:schemas-microsoft-com:vml" xmlns:wp14="http://schemas.microsoft.com/office/word/2010/wordprocessingDrawing" xmlns:wp="http://schemas.openxmlformats.org/drawingml/2006/wordprocessingDrawing" xmlns:w10="urn:schemas-microsoft-com:office:word" xmlns:w="http://schemas.openxmlformats.org/wordprocessingml/2006/main" xmlns:w14="http://schemas.microsoft.com/office/word/2010/wordml" xmlns:w15="http://schemas.microsoft.com/office/word/2012/wordml" xmlns:w16cex="http://schemas.microsoft.com/office/word/2018/wordml/cex" xmlns:w16cid="http://schemas.microsoft.com/office/word/2016/wordml/cid" xmlns:w16="http://schemas.microsoft.com/office/word/2018/wordml" xmlns:w16du="http://schemas.microsoft.com/office/word/2023/wordml/word16du" xmlns:w16sdtdh="http://schemas.microsoft.com/office/word/2020/wordml/sdtdatahash" xmlns:w16sdtfl="http://schemas.microsoft.com/office/word/2024/wordml/sdtformatlock" xmlns:w16se="http://schemas.microsoft.com/office/word/2015/wordml/symex" xmlns:wpg="http://schemas.microsoft.com/office/word/2010/wordprocessingGroup" xmlns:wpi="http://schemas.microsoft.com/office/word/2010/wordprocessingInk" xmlns:wne="http://schemas.microsoft.com/office/word/2006/wordml" xmlns:wps="http://schemas.microsoft.com/office/word/2010/wordprocessingShape" mc:Ignorable="w14 w15 w16se w16cid w16 w16cex w16sdtdh w16sdtfl w16du wp14">
+<w:ftr xmlns:wpc="http://schemas.microsoft.com/office/word/2010/wordprocessingCanvas" xmlns:cx="http://schemas.microsoft.com/office/drawing/2014/chartex" xmlns:mc="http://schemas.openxmlformats.org/markup-compatibility/2006" xmlns:o="urn:schemas-microsoft-com:office:office" xmlns:r="http://schemas.openxmlformats.org/officeDocument/2006/relationships" xmlns:m="http://schemas.openxmlformats.org/officeDocument/2006/math" xmlns:v="urn:schemas-microsoft-com:vml" xmlns:wp14="http://schemas.microsoft.com/office/word/2010/wordprocessingDrawing" xmlns:wp="http://schemas.openxmlformats.org/drawingml/2006/wordprocessingDrawing" xmlns:w10="urn:schemas-microsoft-com:office:word" xmlns:w="http://schemas.openxmlformats.org/wordprocessingml/2006/main" xmlns:w14="http://schemas.microsoft.com/office/word/2010/wordml" xmlns:w15="http://schemas.microsoft.com/office/word/2012/wordml" xmlns:w16se="http://schemas.microsoft.com/office/word/2015/wordml/symex" xmlns:wpg="http://schemas.microsoft.com/office/word/2010/wordprocessingGroup" xmlns:wpi="http://schemas.microsoft.com/office/word/2010/wordprocessingInk" xmlns:wne="http://schemas.microsoft.com/office/word/2006/wordml" xmlns:wps="http://schemas.microsoft.com/office/word/2010/wordprocessingShape" mc:Ignorable="w14 w15 w16se wp14">
   <w:p>
     <w:pPr>
       <w:pStyle w:val="af"/>
@@ -3886,7 +4136,7 @@
     <w:r>
       <w:rPr>
         <w:noProof/>
-        <w:lang w:val="en-US"/>
+        <w:lang w:val="el-GR" w:eastAsia="el-GR"/>
       </w:rPr>
       <w:drawing>
         <wp:inline distT="0" distB="0" distL="0" distR="0" wp14:anchorId="23385242" wp14:editId="446E7450">
@@ -3942,7 +4192,7 @@
 </file>
 
 <file path=word/footnotes.xml><?xml version="1.0" encoding="utf-8"?>
-<w:footnotes xmlns:wpc="http://schemas.microsoft.com/office/word/2010/wordprocessingCanvas" xmlns:cx="http://schemas.microsoft.com/office/drawing/2014/chartex" xmlns:cx1="http://schemas.microsoft.com/office/drawing/2015/9/8/chartex" xmlns:cx2="http://schemas.microsoft.com/office/drawing/2015/10/21/chartex" xmlns:cx3="http://schemas.microsoft.com/office/drawing/2016/5/9/chartex" xmlns:cx4="http://schemas.microsoft.com/office/drawing/2016/5/10/chartex" xmlns:cx5="http://schemas.microsoft.com/office/drawing/2016/5/11/chartex" xmlns:cx6="http://schemas.microsoft.com/office/drawing/2016/5/12/chartex" xmlns:cx7="http://schemas.microsoft.com/office/drawing/2016/5/13/chartex" xmlns:cx8="http://schemas.microsoft.com/office/drawing/2016/5/14/chartex" xmlns:mc="http://schemas.openxmlformats.org/markup-compatibility/2006" xmlns:aink="http://schemas.microsoft.com/office/drawing/2016/ink" xmlns:am3d="http://schemas.microsoft.com/office/drawing/2017/model3d" xmlns:o="urn:schemas-microsoft-com:office:office" xmlns:oel="http://schemas.microsoft.com/office/2019/extlst" xmlns:r="http://schemas.openxmlformats.org/officeDocument/2006/relationships" xmlns:m="http://schemas.openxmlformats.org/officeDocument/2006/math" xmlns:v="urn:schemas-microsoft-com:vml" xmlns:wp14="http://schemas.microsoft.com/office/word/2010/wordprocessingDrawing" xmlns:wp="http://schemas.openxmlformats.org/drawingml/2006/wordprocessingDrawing" xmlns:w10="urn:schemas-microsoft-com:office:word" xmlns:w="http://schemas.openxmlformats.org/wordprocessingml/2006/main" xmlns:w14="http://schemas.microsoft.com/office/word/2010/wordml" xmlns:w15="http://schemas.microsoft.com/office/word/2012/wordml" xmlns:w16cex="http://schemas.microsoft.com/office/word/2018/wordml/cex" xmlns:w16cid="http://schemas.microsoft.com/office/word/2016/wordml/cid" xmlns:w16="http://schemas.microsoft.com/office/word/2018/wordml" xmlns:w16du="http://schemas.microsoft.com/office/word/2023/wordml/word16du" xmlns:w16sdtdh="http://schemas.microsoft.com/office/word/2020/wordml/sdtdatahash" xmlns:w16sdtfl="http://schemas.microsoft.com/office/word/2024/wordml/sdtformatlock" xmlns:w16se="http://schemas.microsoft.com/office/word/2015/wordml/symex" xmlns:wpg="http://schemas.microsoft.com/office/word/2010/wordprocessingGroup" xmlns:wpi="http://schemas.microsoft.com/office/word/2010/wordprocessingInk" xmlns:wne="http://schemas.microsoft.com/office/word/2006/wordml" xmlns:wps="http://schemas.microsoft.com/office/word/2010/wordprocessingShape" mc:Ignorable="w14 w15 w16se w16cid w16 w16cex w16sdtdh w16sdtfl w16du wp14">
+<w:footnotes xmlns:wpc="http://schemas.microsoft.com/office/word/2010/wordprocessingCanvas" xmlns:cx="http://schemas.microsoft.com/office/drawing/2014/chartex" xmlns:mc="http://schemas.openxmlformats.org/markup-compatibility/2006" xmlns:o="urn:schemas-microsoft-com:office:office" xmlns:r="http://schemas.openxmlformats.org/officeDocument/2006/relationships" xmlns:m="http://schemas.openxmlformats.org/officeDocument/2006/math" xmlns:v="urn:schemas-microsoft-com:vml" xmlns:wp14="http://schemas.microsoft.com/office/word/2010/wordprocessingDrawing" xmlns:wp="http://schemas.openxmlformats.org/drawingml/2006/wordprocessingDrawing" xmlns:w10="urn:schemas-microsoft-com:office:word" xmlns:w="http://schemas.openxmlformats.org/wordprocessingml/2006/main" xmlns:w14="http://schemas.microsoft.com/office/word/2010/wordml" xmlns:w15="http://schemas.microsoft.com/office/word/2012/wordml" xmlns:w16se="http://schemas.microsoft.com/office/word/2015/wordml/symex" xmlns:wpg="http://schemas.microsoft.com/office/word/2010/wordprocessingGroup" xmlns:wpi="http://schemas.microsoft.com/office/word/2010/wordprocessingInk" xmlns:wne="http://schemas.microsoft.com/office/word/2006/wordml" xmlns:wps="http://schemas.microsoft.com/office/word/2010/wordprocessingShape" mc:Ignorable="w14 w15 w16se wp14">
   <w:footnote w:type="separator" w:id="-1">
     <w:p>
       <w:r>
@@ -3961,7 +4211,7 @@
 </file>
 
 <file path=word/header1.xml><?xml version="1.0" encoding="utf-8"?>
-<w:hdr xmlns:wpc="http://schemas.microsoft.com/office/word/2010/wordprocessingCanvas" xmlns:cx="http://schemas.microsoft.com/office/drawing/2014/chartex" xmlns:cx1="http://schemas.microsoft.com/office/drawing/2015/9/8/chartex" xmlns:cx2="http://schemas.microsoft.com/office/drawing/2015/10/21/chartex" xmlns:cx3="http://schemas.microsoft.com/office/drawing/2016/5/9/chartex" xmlns:cx4="http://schemas.microsoft.com/office/drawing/2016/5/10/chartex" xmlns:cx5="http://schemas.microsoft.com/office/drawing/2016/5/11/chartex" xmlns:cx6="http://schemas.microsoft.com/office/drawing/2016/5/12/chartex" xmlns:cx7="http://schemas.microsoft.com/office/drawing/2016/5/13/chartex" xmlns:cx8="http://schemas.microsoft.com/office/drawing/2016/5/14/chartex" xmlns:mc="http://schemas.openxmlformats.org/markup-compatibility/2006" xmlns:aink="http://schemas.microsoft.com/office/drawing/2016/ink" xmlns:am3d="http://schemas.microsoft.com/office/drawing/2017/model3d" xmlns:o="urn:schemas-microsoft-com:office:office" xmlns:oel="http://schemas.microsoft.com/office/2019/extlst" xmlns:r="http://schemas.openxmlformats.org/officeDocument/2006/relationships" xmlns:m="http://schemas.openxmlformats.org/officeDocument/2006/math" xmlns:v="urn:schemas-microsoft-com:vml" xmlns:wp14="http://schemas.microsoft.com/office/word/2010/wordprocessingDrawing" xmlns:wp="http://schemas.openxmlformats.org/drawingml/2006/wordprocessingDrawing" xmlns:w10="urn:schemas-microsoft-com:office:word" xmlns:w="http://schemas.openxmlformats.org/wordprocessingml/2006/main" xmlns:w14="http://schemas.microsoft.com/office/word/2010/wordml" xmlns:w15="http://schemas.microsoft.com/office/word/2012/wordml" xmlns:w16cex="http://schemas.microsoft.com/office/word/2018/wordml/cex" xmlns:w16cid="http://schemas.microsoft.com/office/word/2016/wordml/cid" xmlns:w16="http://schemas.microsoft.com/office/word/2018/wordml" xmlns:w16du="http://schemas.microsoft.com/office/word/2023/wordml/word16du" xmlns:w16sdtdh="http://schemas.microsoft.com/office/word/2020/wordml/sdtdatahash" xmlns:w16sdtfl="http://schemas.microsoft.com/office/word/2024/wordml/sdtformatlock" xmlns:w16se="http://schemas.microsoft.com/office/word/2015/wordml/symex" xmlns:wpg="http://schemas.microsoft.com/office/word/2010/wordprocessingGroup" xmlns:wpi="http://schemas.microsoft.com/office/word/2010/wordprocessingInk" xmlns:wne="http://schemas.microsoft.com/office/word/2006/wordml" xmlns:wps="http://schemas.microsoft.com/office/word/2010/wordprocessingShape" mc:Ignorable="w14 w15 w16se w16cid w16 w16cex w16sdtdh w16sdtfl w16du wp14">
+<w:hdr xmlns:wpc="http://schemas.microsoft.com/office/word/2010/wordprocessingCanvas" xmlns:cx="http://schemas.microsoft.com/office/drawing/2014/chartex" xmlns:mc="http://schemas.openxmlformats.org/markup-compatibility/2006" xmlns:o="urn:schemas-microsoft-com:office:office" xmlns:r="http://schemas.openxmlformats.org/officeDocument/2006/relationships" xmlns:m="http://schemas.openxmlformats.org/officeDocument/2006/math" xmlns:v="urn:schemas-microsoft-com:vml" xmlns:wp14="http://schemas.microsoft.com/office/word/2010/wordprocessingDrawing" xmlns:wp="http://schemas.openxmlformats.org/drawingml/2006/wordprocessingDrawing" xmlns:w10="urn:schemas-microsoft-com:office:word" xmlns:w="http://schemas.openxmlformats.org/wordprocessingml/2006/main" xmlns:w14="http://schemas.microsoft.com/office/word/2010/wordml" xmlns:w15="http://schemas.microsoft.com/office/word/2012/wordml" xmlns:w16se="http://schemas.microsoft.com/office/word/2015/wordml/symex" xmlns:wpg="http://schemas.microsoft.com/office/word/2010/wordprocessingGroup" xmlns:wpi="http://schemas.microsoft.com/office/word/2010/wordprocessingInk" xmlns:wne="http://schemas.microsoft.com/office/word/2006/wordml" xmlns:wps="http://schemas.microsoft.com/office/word/2010/wordprocessingShape" mc:Ignorable="w14 w15 w16se wp14">
   <w:p>
     <w:pPr>
       <w:pStyle w:val="af"/>
@@ -3981,7 +4231,7 @@
 </file>
 
 <file path=word/numbering.xml><?xml version="1.0" encoding="utf-8"?>
-<w:numbering xmlns:wpc="http://schemas.microsoft.com/office/word/2010/wordprocessingCanvas" xmlns:cx="http://schemas.microsoft.com/office/drawing/2014/chartex" xmlns:cx1="http://schemas.microsoft.com/office/drawing/2015/9/8/chartex" xmlns:cx2="http://schemas.microsoft.com/office/drawing/2015/10/21/chartex" xmlns:cx3="http://schemas.microsoft.com/office/drawing/2016/5/9/chartex" xmlns:cx4="http://schemas.microsoft.com/office/drawing/2016/5/10/chartex" xmlns:cx5="http://schemas.microsoft.com/office/drawing/2016/5/11/chartex" xmlns:cx6="http://schemas.microsoft.com/office/drawing/2016/5/12/chartex" xmlns:cx7="http://schemas.microsoft.com/office/drawing/2016/5/13/chartex" xmlns:cx8="http://schemas.microsoft.com/office/drawing/2016/5/14/chartex" xmlns:mc="http://schemas.openxmlformats.org/markup-compatibility/2006" xmlns:aink="http://schemas.microsoft.com/office/drawing/2016/ink" xmlns:am3d="http://schemas.microsoft.com/office/drawing/2017/model3d" xmlns:o="urn:schemas-microsoft-com:office:office" xmlns:oel="http://schemas.microsoft.com/office/2019/extlst" xmlns:r="http://schemas.openxmlformats.org/officeDocument/2006/relationships" xmlns:m="http://schemas.openxmlformats.org/officeDocument/2006/math" xmlns:v="urn:schemas-microsoft-com:vml" xmlns:wp14="http://schemas.microsoft.com/office/word/2010/wordprocessingDrawing" xmlns:wp="http://schemas.openxmlformats.org/drawingml/2006/wordprocessingDrawing" xmlns:w10="urn:schemas-microsoft-com:office:word" xmlns:w="http://schemas.openxmlformats.org/wordprocessingml/2006/main" xmlns:w14="http://schemas.microsoft.com/office/word/2010/wordml" xmlns:w15="http://schemas.microsoft.com/office/word/2012/wordml" xmlns:w16cex="http://schemas.microsoft.com/office/word/2018/wordml/cex" xmlns:w16cid="http://schemas.microsoft.com/office/word/2016/wordml/cid" xmlns:w16="http://schemas.microsoft.com/office/word/2018/wordml" xmlns:w16du="http://schemas.microsoft.com/office/word/2023/wordml/word16du" xmlns:w16sdtdh="http://schemas.microsoft.com/office/word/2020/wordml/sdtdatahash" xmlns:w16sdtfl="http://schemas.microsoft.com/office/word/2024/wordml/sdtformatlock" xmlns:w16se="http://schemas.microsoft.com/office/word/2015/wordml/symex" xmlns:wpg="http://schemas.microsoft.com/office/word/2010/wordprocessingGroup" xmlns:wpi="http://schemas.microsoft.com/office/word/2010/wordprocessingInk" xmlns:wne="http://schemas.microsoft.com/office/word/2006/wordml" xmlns:wps="http://schemas.microsoft.com/office/word/2010/wordprocessingShape" mc:Ignorable="w14 w15 w16se w16cid w16 w16cex w16sdtdh w16sdtfl w16du wp14">
+<w:numbering xmlns:wpc="http://schemas.microsoft.com/office/word/2010/wordprocessingCanvas" xmlns:cx="http://schemas.microsoft.com/office/drawing/2014/chartex" xmlns:mc="http://schemas.openxmlformats.org/markup-compatibility/2006" xmlns:o="urn:schemas-microsoft-com:office:office" xmlns:r="http://schemas.openxmlformats.org/officeDocument/2006/relationships" xmlns:m="http://schemas.openxmlformats.org/officeDocument/2006/math" xmlns:v="urn:schemas-microsoft-com:vml" xmlns:wp14="http://schemas.microsoft.com/office/word/2010/wordprocessingDrawing" xmlns:wp="http://schemas.openxmlformats.org/drawingml/2006/wordprocessingDrawing" xmlns:w10="urn:schemas-microsoft-com:office:word" xmlns:w="http://schemas.openxmlformats.org/wordprocessingml/2006/main" xmlns:w14="http://schemas.microsoft.com/office/word/2010/wordml" xmlns:w15="http://schemas.microsoft.com/office/word/2012/wordml" xmlns:w16se="http://schemas.microsoft.com/office/word/2015/wordml/symex" xmlns:wpg="http://schemas.microsoft.com/office/word/2010/wordprocessingGroup" xmlns:wpi="http://schemas.microsoft.com/office/word/2010/wordprocessingInk" xmlns:wne="http://schemas.microsoft.com/office/word/2006/wordml" xmlns:wps="http://schemas.microsoft.com/office/word/2010/wordprocessingShape" mc:Ignorable="w14 w15 w16se wp14">
   <w:abstractNum w:abstractNumId="0" w15:restartNumberingAfterBreak="0">
     <w:nsid w:val="85AE24F5"/>
     <w:multiLevelType w:val="hybridMultilevel"/>
@@ -4377,6 +4627,119 @@
     </w:lvl>
   </w:abstractNum>
   <w:abstractNum w:abstractNumId="5" w15:restartNumberingAfterBreak="0">
+    <w:nsid w:val="3AA104A3"/>
+    <w:multiLevelType w:val="multilevel"/>
+    <w:tmpl w:val="34D2ACAC"/>
+    <w:lvl w:ilvl="0">
+      <w:start w:val="1"/>
+      <w:numFmt w:val="decimal"/>
+      <w:lvlText w:val="%1."/>
+      <w:lvlJc w:val="left"/>
+      <w:pPr>
+        <w:tabs>
+          <w:tab w:val="num" w:pos="720"/>
+        </w:tabs>
+        <w:ind w:left="720" w:hanging="360"/>
+      </w:pPr>
+    </w:lvl>
+    <w:lvl w:ilvl="1" w:tentative="1">
+      <w:start w:val="1"/>
+      <w:numFmt w:val="decimal"/>
+      <w:lvlText w:val="%2."/>
+      <w:lvlJc w:val="left"/>
+      <w:pPr>
+        <w:tabs>
+          <w:tab w:val="num" w:pos="1440"/>
+        </w:tabs>
+        <w:ind w:left="1440" w:hanging="360"/>
+      </w:pPr>
+    </w:lvl>
+    <w:lvl w:ilvl="2" w:tentative="1">
+      <w:start w:val="1"/>
+      <w:numFmt w:val="decimal"/>
+      <w:lvlText w:val="%3."/>
+      <w:lvlJc w:val="left"/>
+      <w:pPr>
+        <w:tabs>
+          <w:tab w:val="num" w:pos="2160"/>
+        </w:tabs>
+        <w:ind w:left="2160" w:hanging="360"/>
+      </w:pPr>
+    </w:lvl>
+    <w:lvl w:ilvl="3" w:tentative="1">
+      <w:start w:val="1"/>
+      <w:numFmt w:val="decimal"/>
+      <w:lvlText w:val="%4."/>
+      <w:lvlJc w:val="left"/>
+      <w:pPr>
+        <w:tabs>
+          <w:tab w:val="num" w:pos="2880"/>
+        </w:tabs>
+        <w:ind w:left="2880" w:hanging="360"/>
+      </w:pPr>
+    </w:lvl>
+    <w:lvl w:ilvl="4" w:tentative="1">
+      <w:start w:val="1"/>
+      <w:numFmt w:val="decimal"/>
+      <w:lvlText w:val="%5."/>
+      <w:lvlJc w:val="left"/>
+      <w:pPr>
+        <w:tabs>
+          <w:tab w:val="num" w:pos="3600"/>
+        </w:tabs>
+        <w:ind w:left="3600" w:hanging="360"/>
+      </w:pPr>
+    </w:lvl>
+    <w:lvl w:ilvl="5" w:tentative="1">
+      <w:start w:val="1"/>
+      <w:numFmt w:val="decimal"/>
+      <w:lvlText w:val="%6."/>
+      <w:lvlJc w:val="left"/>
+      <w:pPr>
+        <w:tabs>
+          <w:tab w:val="num" w:pos="4320"/>
+        </w:tabs>
+        <w:ind w:left="4320" w:hanging="360"/>
+      </w:pPr>
+    </w:lvl>
+    <w:lvl w:ilvl="6" w:tentative="1">
+      <w:start w:val="1"/>
+      <w:numFmt w:val="decimal"/>
+      <w:lvlText w:val="%7."/>
+      <w:lvlJc w:val="left"/>
+      <w:pPr>
+        <w:tabs>
+          <w:tab w:val="num" w:pos="5040"/>
+        </w:tabs>
+        <w:ind w:left="5040" w:hanging="360"/>
+      </w:pPr>
+    </w:lvl>
+    <w:lvl w:ilvl="7" w:tentative="1">
+      <w:start w:val="1"/>
+      <w:numFmt w:val="decimal"/>
+      <w:lvlText w:val="%8."/>
+      <w:lvlJc w:val="left"/>
+      <w:pPr>
+        <w:tabs>
+          <w:tab w:val="num" w:pos="5760"/>
+        </w:tabs>
+        <w:ind w:left="5760" w:hanging="360"/>
+      </w:pPr>
+    </w:lvl>
+    <w:lvl w:ilvl="8" w:tentative="1">
+      <w:start w:val="1"/>
+      <w:numFmt w:val="decimal"/>
+      <w:lvlText w:val="%9."/>
+      <w:lvlJc w:val="left"/>
+      <w:pPr>
+        <w:tabs>
+          <w:tab w:val="num" w:pos="6480"/>
+        </w:tabs>
+        <w:ind w:left="6480" w:hanging="360"/>
+      </w:pPr>
+    </w:lvl>
+  </w:abstractNum>
+  <w:abstractNum w:abstractNumId="6" w15:restartNumberingAfterBreak="0">
     <w:nsid w:val="3EC9574F"/>
     <w:multiLevelType w:val="hybridMultilevel"/>
     <w:tmpl w:val="5A4A2236"/>
@@ -4462,29 +4825,32 @@
       </w:pPr>
     </w:lvl>
   </w:abstractNum>
-  <w:num w:numId="1" w16cid:durableId="1351640969">
+  <w:num w:numId="1">
     <w:abstractNumId w:val="4"/>
   </w:num>
-  <w:num w:numId="2" w16cid:durableId="647630761">
-    <w:abstractNumId w:val="5"/>
+  <w:num w:numId="2">
+    <w:abstractNumId w:val="6"/>
   </w:num>
-  <w:num w:numId="3" w16cid:durableId="802890082">
+  <w:num w:numId="3">
     <w:abstractNumId w:val="3"/>
   </w:num>
-  <w:num w:numId="4" w16cid:durableId="1090347898">
+  <w:num w:numId="4">
     <w:abstractNumId w:val="1"/>
   </w:num>
-  <w:num w:numId="5" w16cid:durableId="903566582">
+  <w:num w:numId="5">
     <w:abstractNumId w:val="2"/>
   </w:num>
-  <w:num w:numId="6" w16cid:durableId="582376346">
+  <w:num w:numId="6">
     <w:abstractNumId w:val="0"/>
+  </w:num>
+  <w:num w:numId="7">
+    <w:abstractNumId w:val="5"/>
   </w:num>
 </w:numbering>
 </file>
 
 <file path=word/styles.xml><?xml version="1.0" encoding="utf-8"?>
-<w:styles xmlns:mc="http://schemas.openxmlformats.org/markup-compatibility/2006" xmlns:r="http://schemas.openxmlformats.org/officeDocument/2006/relationships" xmlns:w="http://schemas.openxmlformats.org/wordprocessingml/2006/main" xmlns:w14="http://schemas.microsoft.com/office/word/2010/wordml" xmlns:w15="http://schemas.microsoft.com/office/word/2012/wordml" xmlns:w16cex="http://schemas.microsoft.com/office/word/2018/wordml/cex" xmlns:w16cid="http://schemas.microsoft.com/office/word/2016/wordml/cid" xmlns:w16="http://schemas.microsoft.com/office/word/2018/wordml" xmlns:w16du="http://schemas.microsoft.com/office/word/2023/wordml/word16du" xmlns:w16sdtdh="http://schemas.microsoft.com/office/word/2020/wordml/sdtdatahash" xmlns:w16sdtfl="http://schemas.microsoft.com/office/word/2024/wordml/sdtformatlock" xmlns:w16se="http://schemas.microsoft.com/office/word/2015/wordml/symex" mc:Ignorable="w14 w15 w16se w16cid w16 w16cex w16sdtdh w16sdtfl w16du">
+<w:styles xmlns:mc="http://schemas.openxmlformats.org/markup-compatibility/2006" xmlns:r="http://schemas.openxmlformats.org/officeDocument/2006/relationships" xmlns:w="http://schemas.openxmlformats.org/wordprocessingml/2006/main" xmlns:w14="http://schemas.microsoft.com/office/word/2010/wordml" xmlns:w15="http://schemas.microsoft.com/office/word/2012/wordml" xmlns:w16se="http://schemas.microsoft.com/office/word/2015/wordml/symex" mc:Ignorable="w14 w15 w16se">
   <w:docDefaults>
     <w:rPrDefault>
       <w:rPr>
@@ -4498,7 +4864,7 @@
       </w:pPr>
     </w:pPrDefault>
   </w:docDefaults>
-  <w:latentStyles w:defLockedState="0" w:defUIPriority="0" w:defSemiHidden="0" w:defUnhideWhenUsed="0" w:defQFormat="0" w:count="376">
+  <w:latentStyles w:defLockedState="0" w:defUIPriority="0" w:defSemiHidden="0" w:defUnhideWhenUsed="0" w:defQFormat="0" w:count="371">
     <w:lsdException w:name="Normal" w:qFormat="1"/>
     <w:lsdException w:name="heading 1" w:qFormat="1"/>
     <w:lsdException w:name="heading 2" w:semiHidden="1" w:unhideWhenUsed="1" w:qFormat="1"/>
@@ -4861,16 +5227,11 @@
     <w:lsdException w:name="List Table 5 Dark Accent 6" w:uiPriority="50"/>
     <w:lsdException w:name="List Table 6 Colorful Accent 6" w:uiPriority="51"/>
     <w:lsdException w:name="List Table 7 Colorful Accent 6" w:uiPriority="52"/>
-    <w:lsdException w:name="Mention" w:semiHidden="1" w:uiPriority="99" w:unhideWhenUsed="1"/>
-    <w:lsdException w:name="Smart Hyperlink" w:semiHidden="1" w:uiPriority="99" w:unhideWhenUsed="1"/>
-    <w:lsdException w:name="Hashtag" w:semiHidden="1" w:uiPriority="99" w:unhideWhenUsed="1"/>
-    <w:lsdException w:name="Unresolved Mention" w:semiHidden="1" w:uiPriority="99" w:unhideWhenUsed="1"/>
-    <w:lsdException w:name="Smart Link" w:semiHidden="1" w:uiPriority="99" w:unhideWhenUsed="1"/>
   </w:latentStyles>
   <w:style w:type="paragraph" w:default="1" w:styleId="a">
     <w:name w:val="Normal"/>
     <w:qFormat/>
-    <w:rsid w:val="00C11ED0"/>
+    <w:rsid w:val="0062496E"/>
     <w:rPr>
       <w:sz w:val="24"/>
       <w:szCs w:val="24"/>
@@ -5855,7 +6216,7 @@
 </file>
 
 <file path=customXml/itemProps1.xml><?xml version="1.0" encoding="utf-8"?>
-<ds:datastoreItem xmlns:ds="http://schemas.openxmlformats.org/officeDocument/2006/customXml" ds:itemID="{AA1539BD-7431-4670-BB22-7430B6339D30}">
+<ds:datastoreItem xmlns:ds="http://schemas.openxmlformats.org/officeDocument/2006/customXml" ds:itemID="{E37CF31F-62A3-4EC6-9402-1010700175E9}">
   <ds:schemaRefs>
     <ds:schemaRef ds:uri="http://schemas.openxmlformats.org/officeDocument/2006/bibliography"/>
   </ds:schemaRefs>

</xml_diff>